<commit_message>
Organize State FlowChart Diagram
</commit_message>
<xml_diff>
--- a/Documentation/INFORM-SHS AT CFEI.docx
+++ b/Documentation/INFORM-SHS AT CFEI.docx
@@ -255,6 +255,23 @@
         <w:spacing w:after="160" w:lineRule="auto"/>
         <w:jc w:val="center"/>
         <w:rPr>
+          <w:b w:val="1"/>
+          <w:bCs w:val="1"/>
+          <w:sz w:val="24"/>
+          <w:szCs w:val="24"/>
+        </w:rPr>
+      </w:pPr>
+      <w:r>
+        <w:rPr>
+          <w:rtl w:val="0"/>
+        </w:rPr>
+      </w:r>
+    </w:p>
+    <w:p>
+      <w:pPr>
+        <w:spacing w:after="160" w:lineRule="auto"/>
+        <w:jc w:val="center"/>
+        <w:rPr>
           <w:sz w:val="24"/>
           <w:szCs w:val="24"/>
         </w:rPr>
@@ -1168,14 +1185,14 @@
         </w:rPr>
         <w:drawing>
           <wp:inline distB="114300" distT="114300" distL="114300" distR="114300">
-            <wp:extent cx="5734050" cy="6921847"/>
+            <wp:extent cx="5638800" cy="7734300"/>
             <wp:effectExtent b="0" l="0" r="0" t="0"/>
-            <wp:docPr id="1" name="image8.jpg"/>
+            <wp:docPr id="5" name="image7.png"/>
             <a:graphic>
               <a:graphicData uri="http://schemas.openxmlformats.org/drawingml/2006/picture">
                 <pic:pic>
                   <pic:nvPicPr>
-                    <pic:cNvPr id="0" name="image8.jpg"/>
+                    <pic:cNvPr id="0" name="image7.png"/>
                     <pic:cNvPicPr preferRelativeResize="0"/>
                   </pic:nvPicPr>
                   <pic:blipFill>
@@ -1188,7 +1205,7 @@
                   <pic:spPr>
                     <a:xfrm>
                       <a:off x="0" y="0"/>
-                      <a:ext cx="5734050" cy="6921847"/>
+                      <a:ext cx="5638800" cy="7734300"/>
                     </a:xfrm>
                     <a:prstGeom prst="rect"/>
                     <a:ln/>
@@ -1210,12 +1227,33 @@
         <w:spacing w:after="0" w:before="0" w:line="480" w:lineRule="auto"/>
         <w:jc w:val="center"/>
         <w:rPr>
-          <w:sz w:val="24"/>
-          <w:szCs w:val="24"/>
-        </w:rPr>
-      </w:pPr>
-      <w:r>
-        <w:rPr>
+          <w:b w:val="1"/>
+          <w:bCs w:val="1"/>
+          <w:sz w:val="24"/>
+          <w:szCs w:val="24"/>
+        </w:rPr>
+      </w:pPr>
+      <w:r>
+        <w:rPr>
+          <w:rtl w:val="0"/>
+        </w:rPr>
+      </w:r>
+    </w:p>
+    <w:p>
+      <w:pPr>
+        <w:spacing w:after="0" w:before="0" w:line="480" w:lineRule="auto"/>
+        <w:jc w:val="center"/>
+        <w:rPr>
+          <w:b w:val="1"/>
+          <w:bCs w:val="1"/>
+          <w:sz w:val="24"/>
+          <w:szCs w:val="24"/>
+        </w:rPr>
+      </w:pPr>
+      <w:r>
+        <w:rPr>
+          <w:b w:val="1"/>
+          <w:bCs w:val="1"/>
           <w:sz w:val="24"/>
           <w:szCs w:val="24"/>
           <w:rtl w:val="0"/>
@@ -1244,57 +1282,6 @@
           <w:rtl w:val="0"/>
         </w:rPr>
         <w:t xml:space="preserve">Theoretical Framework</w:t>
-      </w:r>
-    </w:p>
-    <w:p>
-      <w:pPr>
-        <w:spacing w:after="0" w:before="0" w:line="480" w:lineRule="auto"/>
-        <w:jc w:val="left"/>
-        <w:rPr>
-          <w:b w:val="1"/>
-          <w:bCs w:val="1"/>
-          <w:sz w:val="24"/>
-          <w:szCs w:val="24"/>
-        </w:rPr>
-      </w:pPr>
-      <w:r>
-        <w:rPr>
-          <w:rtl w:val="0"/>
-        </w:rPr>
-      </w:r>
-    </w:p>
-    <w:p>
-      <w:pPr>
-        <w:spacing w:after="0" w:before="0" w:line="480" w:lineRule="auto"/>
-        <w:jc w:val="left"/>
-        <w:rPr>
-          <w:b w:val="1"/>
-          <w:bCs w:val="1"/>
-          <w:sz w:val="24"/>
-          <w:szCs w:val="24"/>
-        </w:rPr>
-      </w:pPr>
-      <w:r>
-        <w:rPr>
-          <w:rtl w:val="0"/>
-        </w:rPr>
-      </w:r>
-    </w:p>
-    <w:p>
-      <w:pPr>
-        <w:spacing w:after="0" w:before="0" w:line="480" w:lineRule="auto"/>
-        <w:jc w:val="left"/>
-        <w:rPr>
-          <w:b w:val="1"/>
-          <w:bCs w:val="1"/>
-          <w:sz w:val="24"/>
-          <w:szCs w:val="24"/>
-        </w:rPr>
-      </w:pPr>
-      <w:r>
-        <w:rPr>
-          <w:rtl w:val="0"/>
-        </w:rPr>
       </w:r>
     </w:p>
     <w:p>
@@ -5832,12 +5819,12 @@
           <wp:inline distB="114300" distT="114300" distL="114300" distR="114300">
             <wp:extent cx="5731200" cy="5346700"/>
             <wp:effectExtent b="0" l="0" r="0" t="0"/>
-            <wp:docPr id="7" name="image5.png"/>
+            <wp:docPr id="7" name="image8.png"/>
             <a:graphic>
               <a:graphicData uri="http://schemas.openxmlformats.org/drawingml/2006/picture">
                 <pic:pic>
                   <pic:nvPicPr>
-                    <pic:cNvPr id="0" name="image5.png"/>
+                    <pic:cNvPr id="0" name="image8.png"/>
                     <pic:cNvPicPr preferRelativeResize="0"/>
                   </pic:nvPicPr>
                   <pic:blipFill>
@@ -18416,12 +18403,12 @@
           <wp:inline distB="114300" distT="114300" distL="114300" distR="114300">
             <wp:extent cx="5910263" cy="8105775"/>
             <wp:effectExtent b="0" l="0" r="0" t="0"/>
-            <wp:docPr id="2" name="image4.png"/>
+            <wp:docPr id="1" name="image1.png"/>
             <a:graphic>
               <a:graphicData uri="http://schemas.openxmlformats.org/drawingml/2006/picture">
                 <pic:pic>
                   <pic:nvPicPr>
-                    <pic:cNvPr id="0" name="image4.png"/>
+                    <pic:cNvPr id="0" name="image1.png"/>
                     <pic:cNvPicPr preferRelativeResize="0"/>
                   </pic:nvPicPr>
                   <pic:blipFill>
@@ -18517,12 +18504,12 @@
           <wp:inline distB="114300" distT="114300" distL="114300" distR="114300">
             <wp:extent cx="5734050" cy="7748588"/>
             <wp:effectExtent b="0" l="0" r="0" t="0"/>
-            <wp:docPr id="8" name="image3.png"/>
+            <wp:docPr id="8" name="image2.png"/>
             <a:graphic>
               <a:graphicData uri="http://schemas.openxmlformats.org/drawingml/2006/picture">
                 <pic:pic>
                   <pic:nvPicPr>
-                    <pic:cNvPr id="0" name="image3.png"/>
+                    <pic:cNvPr id="0" name="image2.png"/>
                     <pic:cNvPicPr preferRelativeResize="0"/>
                   </pic:nvPicPr>
                   <pic:blipFill>
@@ -47092,14 +47079,14 @@
         </w:rPr>
         <w:drawing>
           <wp:inline distB="114300" distT="114300" distL="114300" distR="114300">
-            <wp:extent cx="5734050" cy="8091488"/>
+            <wp:extent cx="5734050" cy="8101013"/>
             <wp:effectExtent b="0" l="0" r="0" t="0"/>
-            <wp:docPr id="4" name="image1.png"/>
+            <wp:docPr id="3" name="image4.png"/>
             <a:graphic>
               <a:graphicData uri="http://schemas.openxmlformats.org/drawingml/2006/picture">
                 <pic:pic>
                   <pic:nvPicPr>
-                    <pic:cNvPr id="0" name="image1.png"/>
+                    <pic:cNvPr id="0" name="image4.png"/>
                     <pic:cNvPicPr preferRelativeResize="0"/>
                   </pic:nvPicPr>
                   <pic:blipFill>
@@ -47112,7 +47099,7 @@
                   <pic:spPr>
                     <a:xfrm>
                       <a:off x="0" y="0"/>
-                      <a:ext cx="5734050" cy="8091488"/>
+                      <a:ext cx="5734050" cy="8101013"/>
                     </a:xfrm>
                     <a:prstGeom prst="rect"/>
                     <a:ln/>
@@ -47630,12 +47617,12 @@
           <wp:inline distB="114300" distT="114300" distL="114300" distR="114300">
             <wp:extent cx="5734050" cy="6853238"/>
             <wp:effectExtent b="0" l="0" r="0" t="0"/>
-            <wp:docPr id="6" name="image7.png"/>
+            <wp:docPr id="6" name="image3.png"/>
             <a:graphic>
               <a:graphicData uri="http://schemas.openxmlformats.org/drawingml/2006/picture">
                 <pic:pic>
                   <pic:nvPicPr>
-                    <pic:cNvPr id="0" name="image7.png"/>
+                    <pic:cNvPr id="0" name="image3.png"/>
                     <pic:cNvPicPr preferRelativeResize="0"/>
                   </pic:nvPicPr>
                   <pic:blipFill>
@@ -47804,12 +47791,12 @@
           <wp:inline distB="114300" distT="114300" distL="114300" distR="114300">
             <wp:extent cx="5734050" cy="2768947"/>
             <wp:effectExtent b="0" l="0" r="0" t="0"/>
-            <wp:docPr id="3" name="image6.png"/>
+            <wp:docPr id="2" name="image5.png"/>
             <a:graphic>
               <a:graphicData uri="http://schemas.openxmlformats.org/drawingml/2006/picture">
                 <pic:pic>
                   <pic:nvPicPr>
-                    <pic:cNvPr id="0" name="image6.png"/>
+                    <pic:cNvPr id="0" name="image5.png"/>
                     <pic:cNvPicPr preferRelativeResize="0"/>
                   </pic:nvPicPr>
                   <pic:blipFill>
@@ -47883,12 +47870,12 @@
           <wp:inline distB="114300" distT="114300" distL="114300" distR="114300">
             <wp:extent cx="5734050" cy="4573116"/>
             <wp:effectExtent b="0" l="0" r="0" t="0"/>
-            <wp:docPr id="5" name="image2.png"/>
+            <wp:docPr id="4" name="image6.png"/>
             <a:graphic>
               <a:graphicData uri="http://schemas.openxmlformats.org/drawingml/2006/picture">
                 <pic:pic>
                   <pic:nvPicPr>
-                    <pic:cNvPr id="0" name="image2.png"/>
+                    <pic:cNvPr id="0" name="image6.png"/>
                     <pic:cNvPicPr preferRelativeResize="0"/>
                   </pic:nvPicPr>
                   <pic:blipFill>
@@ -47942,6 +47929,431 @@
     </w:p>
     <w:p>
       <w:pPr>
+        <w:spacing w:line="480" w:lineRule="auto"/>
+        <w:jc w:val="both"/>
+        <w:rPr>
+          <w:b w:val="1"/>
+          <w:bCs w:val="1"/>
+          <w:sz w:val="24"/>
+          <w:szCs w:val="24"/>
+        </w:rPr>
+      </w:pPr>
+      <w:r>
+        <w:rPr>
+          <w:rtl w:val="0"/>
+        </w:rPr>
+      </w:r>
+    </w:p>
+    <w:p>
+      <w:pPr>
+        <w:spacing w:line="480" w:lineRule="auto"/>
+        <w:jc w:val="center"/>
+        <w:rPr>
+          <w:b w:val="1"/>
+          <w:bCs w:val="1"/>
+          <w:sz w:val="24"/>
+          <w:szCs w:val="24"/>
+        </w:rPr>
+      </w:pPr>
+      <w:r>
+        <w:rPr>
+          <w:rtl w:val="0"/>
+        </w:rPr>
+      </w:r>
+    </w:p>
+    <w:p>
+      <w:pPr>
+        <w:spacing w:line="480" w:lineRule="auto"/>
+        <w:jc w:val="center"/>
+        <w:rPr>
+          <w:b w:val="1"/>
+          <w:bCs w:val="1"/>
+          <w:sz w:val="24"/>
+          <w:szCs w:val="24"/>
+        </w:rPr>
+      </w:pPr>
+      <w:r>
+        <w:rPr>
+          <w:rtl w:val="0"/>
+        </w:rPr>
+      </w:r>
+    </w:p>
+    <w:p>
+      <w:pPr>
+        <w:spacing w:line="480" w:lineRule="auto"/>
+        <w:jc w:val="center"/>
+        <w:rPr>
+          <w:b w:val="1"/>
+          <w:bCs w:val="1"/>
+          <w:sz w:val="24"/>
+          <w:szCs w:val="24"/>
+        </w:rPr>
+      </w:pPr>
+      <w:r>
+        <w:rPr>
+          <w:rtl w:val="0"/>
+        </w:rPr>
+      </w:r>
+    </w:p>
+    <w:p>
+      <w:pPr>
+        <w:spacing w:line="480" w:lineRule="auto"/>
+        <w:jc w:val="center"/>
+        <w:rPr>
+          <w:b w:val="1"/>
+          <w:bCs w:val="1"/>
+          <w:sz w:val="24"/>
+          <w:szCs w:val="24"/>
+        </w:rPr>
+      </w:pPr>
+      <w:r>
+        <w:rPr>
+          <w:rtl w:val="0"/>
+        </w:rPr>
+      </w:r>
+    </w:p>
+    <w:p>
+      <w:pPr>
+        <w:spacing w:line="480" w:lineRule="auto"/>
+        <w:jc w:val="center"/>
+        <w:rPr>
+          <w:b w:val="1"/>
+          <w:bCs w:val="1"/>
+          <w:sz w:val="24"/>
+          <w:szCs w:val="24"/>
+        </w:rPr>
+      </w:pPr>
+      <w:r>
+        <w:rPr>
+          <w:rtl w:val="0"/>
+        </w:rPr>
+      </w:r>
+    </w:p>
+    <w:p>
+      <w:pPr>
+        <w:spacing w:line="480" w:lineRule="auto"/>
+        <w:jc w:val="center"/>
+        <w:rPr>
+          <w:b w:val="1"/>
+          <w:bCs w:val="1"/>
+          <w:sz w:val="24"/>
+          <w:szCs w:val="24"/>
+        </w:rPr>
+      </w:pPr>
+      <w:r>
+        <w:rPr>
+          <w:rtl w:val="0"/>
+        </w:rPr>
+      </w:r>
+    </w:p>
+    <w:p>
+      <w:pPr>
+        <w:spacing w:line="480" w:lineRule="auto"/>
+        <w:jc w:val="center"/>
+        <w:rPr>
+          <w:b w:val="1"/>
+          <w:bCs w:val="1"/>
+          <w:sz w:val="24"/>
+          <w:szCs w:val="24"/>
+        </w:rPr>
+      </w:pPr>
+      <w:r>
+        <w:rPr>
+          <w:rtl w:val="0"/>
+        </w:rPr>
+      </w:r>
+    </w:p>
+    <w:p>
+      <w:pPr>
+        <w:spacing w:line="480" w:lineRule="auto"/>
+        <w:jc w:val="center"/>
+        <w:rPr>
+          <w:b w:val="1"/>
+          <w:bCs w:val="1"/>
+          <w:sz w:val="24"/>
+          <w:szCs w:val="24"/>
+        </w:rPr>
+      </w:pPr>
+      <w:r>
+        <w:rPr>
+          <w:rtl w:val="0"/>
+        </w:rPr>
+      </w:r>
+    </w:p>
+    <w:p>
+      <w:pPr>
+        <w:spacing w:line="480" w:lineRule="auto"/>
+        <w:jc w:val="center"/>
+        <w:rPr>
+          <w:b w:val="1"/>
+          <w:bCs w:val="1"/>
+          <w:sz w:val="24"/>
+          <w:szCs w:val="24"/>
+        </w:rPr>
+      </w:pPr>
+      <w:r>
+        <w:rPr>
+          <w:rtl w:val="0"/>
+        </w:rPr>
+      </w:r>
+    </w:p>
+    <w:p>
+      <w:pPr>
+        <w:spacing w:line="480" w:lineRule="auto"/>
+        <w:jc w:val="center"/>
+        <w:rPr>
+          <w:b w:val="1"/>
+          <w:bCs w:val="1"/>
+          <w:sz w:val="24"/>
+          <w:szCs w:val="24"/>
+        </w:rPr>
+      </w:pPr>
+      <w:r>
+        <w:rPr>
+          <w:rtl w:val="0"/>
+        </w:rPr>
+      </w:r>
+    </w:p>
+    <w:p>
+      <w:pPr>
+        <w:spacing w:line="480" w:lineRule="auto"/>
+        <w:jc w:val="center"/>
+        <w:rPr>
+          <w:b w:val="1"/>
+          <w:bCs w:val="1"/>
+          <w:sz w:val="24"/>
+          <w:szCs w:val="24"/>
+        </w:rPr>
+      </w:pPr>
+      <w:r>
+        <w:rPr>
+          <w:rtl w:val="0"/>
+        </w:rPr>
+      </w:r>
+    </w:p>
+    <w:p>
+      <w:pPr>
+        <w:spacing w:line="480" w:lineRule="auto"/>
+        <w:jc w:val="center"/>
+        <w:rPr>
+          <w:b w:val="1"/>
+          <w:bCs w:val="1"/>
+          <w:sz w:val="24"/>
+          <w:szCs w:val="24"/>
+        </w:rPr>
+      </w:pPr>
+      <w:r>
+        <w:rPr>
+          <w:rtl w:val="0"/>
+        </w:rPr>
+      </w:r>
+    </w:p>
+    <w:p>
+      <w:pPr>
+        <w:spacing w:line="480" w:lineRule="auto"/>
+        <w:jc w:val="center"/>
+        <w:rPr>
+          <w:b w:val="1"/>
+          <w:bCs w:val="1"/>
+          <w:sz w:val="24"/>
+          <w:szCs w:val="24"/>
+        </w:rPr>
+      </w:pPr>
+      <w:r>
+        <w:rPr>
+          <w:rtl w:val="0"/>
+        </w:rPr>
+      </w:r>
+    </w:p>
+    <w:p>
+      <w:pPr>
+        <w:spacing w:line="480" w:lineRule="auto"/>
+        <w:jc w:val="center"/>
+        <w:rPr>
+          <w:b w:val="1"/>
+          <w:bCs w:val="1"/>
+          <w:sz w:val="24"/>
+          <w:szCs w:val="24"/>
+        </w:rPr>
+      </w:pPr>
+      <w:r>
+        <w:rPr>
+          <w:rtl w:val="0"/>
+        </w:rPr>
+      </w:r>
+    </w:p>
+    <w:p>
+      <w:pPr>
+        <w:spacing w:line="480" w:lineRule="auto"/>
+        <w:jc w:val="center"/>
+        <w:rPr>
+          <w:b w:val="1"/>
+          <w:bCs w:val="1"/>
+          <w:sz w:val="24"/>
+          <w:szCs w:val="24"/>
+        </w:rPr>
+      </w:pPr>
+      <w:r>
+        <w:rPr>
+          <w:rtl w:val="0"/>
+        </w:rPr>
+      </w:r>
+    </w:p>
+    <w:p>
+      <w:pPr>
+        <w:spacing w:line="480" w:lineRule="auto"/>
+        <w:jc w:val="center"/>
+        <w:rPr>
+          <w:b w:val="1"/>
+          <w:bCs w:val="1"/>
+          <w:sz w:val="24"/>
+          <w:szCs w:val="24"/>
+        </w:rPr>
+      </w:pPr>
+      <w:r>
+        <w:rPr>
+          <w:rtl w:val="0"/>
+        </w:rPr>
+      </w:r>
+    </w:p>
+    <w:p>
+      <w:pPr>
+        <w:spacing w:line="480" w:lineRule="auto"/>
+        <w:jc w:val="center"/>
+        <w:rPr>
+          <w:b w:val="1"/>
+          <w:bCs w:val="1"/>
+          <w:sz w:val="24"/>
+          <w:szCs w:val="24"/>
+        </w:rPr>
+      </w:pPr>
+      <w:r>
+        <w:rPr>
+          <w:rtl w:val="0"/>
+        </w:rPr>
+      </w:r>
+    </w:p>
+    <w:p>
+      <w:pPr>
+        <w:spacing w:line="480" w:lineRule="auto"/>
+        <w:jc w:val="center"/>
+        <w:rPr>
+          <w:b w:val="1"/>
+          <w:bCs w:val="1"/>
+          <w:sz w:val="24"/>
+          <w:szCs w:val="24"/>
+        </w:rPr>
+      </w:pPr>
+      <w:r>
+        <w:rPr>
+          <w:rtl w:val="0"/>
+        </w:rPr>
+      </w:r>
+    </w:p>
+    <w:p>
+      <w:pPr>
+        <w:spacing w:line="480" w:lineRule="auto"/>
+        <w:jc w:val="center"/>
+        <w:rPr>
+          <w:b w:val="1"/>
+          <w:bCs w:val="1"/>
+          <w:sz w:val="24"/>
+          <w:szCs w:val="24"/>
+        </w:rPr>
+      </w:pPr>
+      <w:r>
+        <w:rPr>
+          <w:rtl w:val="0"/>
+        </w:rPr>
+      </w:r>
+    </w:p>
+    <w:p>
+      <w:pPr>
+        <w:spacing w:line="480" w:lineRule="auto"/>
+        <w:jc w:val="center"/>
+        <w:rPr>
+          <w:b w:val="1"/>
+          <w:bCs w:val="1"/>
+          <w:sz w:val="24"/>
+          <w:szCs w:val="24"/>
+        </w:rPr>
+      </w:pPr>
+      <w:r>
+        <w:rPr>
+          <w:rtl w:val="0"/>
+        </w:rPr>
+      </w:r>
+    </w:p>
+    <w:p>
+      <w:pPr>
+        <w:spacing w:line="480" w:lineRule="auto"/>
+        <w:jc w:val="center"/>
+        <w:rPr>
+          <w:b w:val="1"/>
+          <w:bCs w:val="1"/>
+          <w:sz w:val="24"/>
+          <w:szCs w:val="24"/>
+        </w:rPr>
+      </w:pPr>
+      <w:r>
+        <w:rPr>
+          <w:rtl w:val="0"/>
+        </w:rPr>
+      </w:r>
+    </w:p>
+    <w:p>
+      <w:pPr>
+        <w:spacing w:line="480" w:lineRule="auto"/>
+        <w:jc w:val="center"/>
+        <w:rPr>
+          <w:b w:val="1"/>
+          <w:bCs w:val="1"/>
+          <w:sz w:val="24"/>
+          <w:szCs w:val="24"/>
+        </w:rPr>
+      </w:pPr>
+      <w:r>
+        <w:rPr>
+          <w:rtl w:val="0"/>
+        </w:rPr>
+      </w:r>
+    </w:p>
+    <w:p>
+      <w:pPr>
+        <w:spacing w:line="480" w:lineRule="auto"/>
+        <w:jc w:val="center"/>
+        <w:rPr>
+          <w:b w:val="1"/>
+          <w:bCs w:val="1"/>
+          <w:sz w:val="24"/>
+          <w:szCs w:val="24"/>
+        </w:rPr>
+      </w:pPr>
+      <w:r>
+        <w:rPr>
+          <w:rtl w:val="0"/>
+        </w:rPr>
+      </w:r>
+    </w:p>
+    <w:p>
+      <w:pPr>
+        <w:spacing w:line="480" w:lineRule="auto"/>
+        <w:jc w:val="center"/>
+        <w:rPr>
+          <w:b w:val="1"/>
+          <w:bCs w:val="1"/>
+          <w:sz w:val="24"/>
+          <w:szCs w:val="24"/>
+        </w:rPr>
+      </w:pPr>
+      <w:r>
+        <w:rPr>
+          <w:rtl w:val="0"/>
+        </w:rPr>
+      </w:r>
+    </w:p>
+    <w:p>
+      <w:pPr>
         <w:pStyle w:val="Heading3"/>
         <w:keepNext w:val="0"/>
         <w:keepLines w:val="0"/>
@@ -49489,6 +49901,447 @@
         <w:ind w:left="0" w:firstLine="0"/>
         <w:jc w:val="both"/>
         <w:rPr>
+          <w:sz w:val="24"/>
+          <w:szCs w:val="24"/>
+        </w:rPr>
+      </w:pPr>
+      <w:r>
+        <w:rPr>
+          <w:rtl w:val="0"/>
+        </w:rPr>
+      </w:r>
+    </w:p>
+    <w:p>
+      <w:pPr>
+        <w:pBdr>
+          <w:top w:color="auto" w:space="0" w:sz="0" w:val="none"/>
+          <w:left w:color="auto" w:space="0" w:sz="0" w:val="none"/>
+          <w:bottom w:color="auto" w:space="0" w:sz="0" w:val="none"/>
+          <w:right w:color="auto" w:space="0" w:sz="0" w:val="none"/>
+          <w:between w:color="auto" w:space="0" w:sz="0" w:val="none"/>
+        </w:pBdr>
+        <w:shd w:fill="ffffff" w:val="clear"/>
+        <w:spacing w:line="480" w:lineRule="auto"/>
+        <w:ind w:left="0" w:firstLine="0"/>
+        <w:jc w:val="both"/>
+        <w:rPr>
+          <w:sz w:val="24"/>
+          <w:szCs w:val="24"/>
+        </w:rPr>
+      </w:pPr>
+      <w:r>
+        <w:rPr>
+          <w:rtl w:val="0"/>
+        </w:rPr>
+      </w:r>
+    </w:p>
+    <w:p>
+      <w:pPr>
+        <w:pBdr>
+          <w:top w:color="auto" w:space="0" w:sz="0" w:val="none"/>
+          <w:left w:color="auto" w:space="0" w:sz="0" w:val="none"/>
+          <w:bottom w:color="auto" w:space="0" w:sz="0" w:val="none"/>
+          <w:right w:color="auto" w:space="0" w:sz="0" w:val="none"/>
+          <w:between w:color="auto" w:space="0" w:sz="0" w:val="none"/>
+        </w:pBdr>
+        <w:shd w:fill="ffffff" w:val="clear"/>
+        <w:spacing w:line="480" w:lineRule="auto"/>
+        <w:ind w:left="0" w:firstLine="0"/>
+        <w:jc w:val="both"/>
+        <w:rPr>
+          <w:sz w:val="24"/>
+          <w:szCs w:val="24"/>
+        </w:rPr>
+      </w:pPr>
+      <w:r>
+        <w:rPr>
+          <w:rtl w:val="0"/>
+        </w:rPr>
+      </w:r>
+    </w:p>
+    <w:p>
+      <w:pPr>
+        <w:pBdr>
+          <w:top w:color="auto" w:space="0" w:sz="0" w:val="none"/>
+          <w:left w:color="auto" w:space="0" w:sz="0" w:val="none"/>
+          <w:bottom w:color="auto" w:space="0" w:sz="0" w:val="none"/>
+          <w:right w:color="auto" w:space="0" w:sz="0" w:val="none"/>
+          <w:between w:color="auto" w:space="0" w:sz="0" w:val="none"/>
+        </w:pBdr>
+        <w:shd w:fill="ffffff" w:val="clear"/>
+        <w:spacing w:line="480" w:lineRule="auto"/>
+        <w:ind w:left="0" w:firstLine="0"/>
+        <w:jc w:val="both"/>
+        <w:rPr>
+          <w:sz w:val="24"/>
+          <w:szCs w:val="24"/>
+        </w:rPr>
+      </w:pPr>
+      <w:r>
+        <w:rPr>
+          <w:rtl w:val="0"/>
+        </w:rPr>
+      </w:r>
+    </w:p>
+    <w:p>
+      <w:pPr>
+        <w:pBdr>
+          <w:top w:color="auto" w:space="0" w:sz="0" w:val="none"/>
+          <w:left w:color="auto" w:space="0" w:sz="0" w:val="none"/>
+          <w:bottom w:color="auto" w:space="0" w:sz="0" w:val="none"/>
+          <w:right w:color="auto" w:space="0" w:sz="0" w:val="none"/>
+          <w:between w:color="auto" w:space="0" w:sz="0" w:val="none"/>
+        </w:pBdr>
+        <w:shd w:fill="ffffff" w:val="clear"/>
+        <w:spacing w:line="480" w:lineRule="auto"/>
+        <w:ind w:left="0" w:firstLine="0"/>
+        <w:jc w:val="both"/>
+        <w:rPr>
+          <w:sz w:val="24"/>
+          <w:szCs w:val="24"/>
+        </w:rPr>
+      </w:pPr>
+      <w:r>
+        <w:rPr>
+          <w:rtl w:val="0"/>
+        </w:rPr>
+      </w:r>
+    </w:p>
+    <w:p>
+      <w:pPr>
+        <w:pBdr>
+          <w:top w:color="auto" w:space="0" w:sz="0" w:val="none"/>
+          <w:left w:color="auto" w:space="0" w:sz="0" w:val="none"/>
+          <w:bottom w:color="auto" w:space="0" w:sz="0" w:val="none"/>
+          <w:right w:color="auto" w:space="0" w:sz="0" w:val="none"/>
+          <w:between w:color="auto" w:space="0" w:sz="0" w:val="none"/>
+        </w:pBdr>
+        <w:shd w:fill="ffffff" w:val="clear"/>
+        <w:spacing w:line="480" w:lineRule="auto"/>
+        <w:ind w:left="0" w:firstLine="0"/>
+        <w:jc w:val="both"/>
+        <w:rPr>
+          <w:sz w:val="24"/>
+          <w:szCs w:val="24"/>
+        </w:rPr>
+      </w:pPr>
+      <w:r>
+        <w:rPr>
+          <w:rtl w:val="0"/>
+        </w:rPr>
+      </w:r>
+    </w:p>
+    <w:p>
+      <w:pPr>
+        <w:pBdr>
+          <w:top w:color="auto" w:space="0" w:sz="0" w:val="none"/>
+          <w:left w:color="auto" w:space="0" w:sz="0" w:val="none"/>
+          <w:bottom w:color="auto" w:space="0" w:sz="0" w:val="none"/>
+          <w:right w:color="auto" w:space="0" w:sz="0" w:val="none"/>
+          <w:between w:color="auto" w:space="0" w:sz="0" w:val="none"/>
+        </w:pBdr>
+        <w:shd w:fill="ffffff" w:val="clear"/>
+        <w:spacing w:line="480" w:lineRule="auto"/>
+        <w:ind w:left="0" w:firstLine="0"/>
+        <w:jc w:val="both"/>
+        <w:rPr>
+          <w:sz w:val="24"/>
+          <w:szCs w:val="24"/>
+        </w:rPr>
+      </w:pPr>
+      <w:r>
+        <w:rPr>
+          <w:rtl w:val="0"/>
+        </w:rPr>
+      </w:r>
+    </w:p>
+    <w:p>
+      <w:pPr>
+        <w:pBdr>
+          <w:top w:color="auto" w:space="0" w:sz="0" w:val="none"/>
+          <w:left w:color="auto" w:space="0" w:sz="0" w:val="none"/>
+          <w:bottom w:color="auto" w:space="0" w:sz="0" w:val="none"/>
+          <w:right w:color="auto" w:space="0" w:sz="0" w:val="none"/>
+          <w:between w:color="auto" w:space="0" w:sz="0" w:val="none"/>
+        </w:pBdr>
+        <w:shd w:fill="ffffff" w:val="clear"/>
+        <w:spacing w:line="480" w:lineRule="auto"/>
+        <w:ind w:left="0" w:firstLine="0"/>
+        <w:jc w:val="both"/>
+        <w:rPr>
+          <w:sz w:val="24"/>
+          <w:szCs w:val="24"/>
+        </w:rPr>
+      </w:pPr>
+      <w:r>
+        <w:rPr>
+          <w:rtl w:val="0"/>
+        </w:rPr>
+      </w:r>
+    </w:p>
+    <w:p>
+      <w:pPr>
+        <w:pBdr>
+          <w:top w:color="auto" w:space="0" w:sz="0" w:val="none"/>
+          <w:left w:color="auto" w:space="0" w:sz="0" w:val="none"/>
+          <w:bottom w:color="auto" w:space="0" w:sz="0" w:val="none"/>
+          <w:right w:color="auto" w:space="0" w:sz="0" w:val="none"/>
+          <w:between w:color="auto" w:space="0" w:sz="0" w:val="none"/>
+        </w:pBdr>
+        <w:shd w:fill="ffffff" w:val="clear"/>
+        <w:spacing w:line="480" w:lineRule="auto"/>
+        <w:ind w:left="0" w:firstLine="0"/>
+        <w:jc w:val="both"/>
+        <w:rPr>
+          <w:sz w:val="24"/>
+          <w:szCs w:val="24"/>
+        </w:rPr>
+      </w:pPr>
+      <w:r>
+        <w:rPr>
+          <w:rtl w:val="0"/>
+        </w:rPr>
+      </w:r>
+    </w:p>
+    <w:p>
+      <w:pPr>
+        <w:pBdr>
+          <w:top w:color="auto" w:space="0" w:sz="0" w:val="none"/>
+          <w:left w:color="auto" w:space="0" w:sz="0" w:val="none"/>
+          <w:bottom w:color="auto" w:space="0" w:sz="0" w:val="none"/>
+          <w:right w:color="auto" w:space="0" w:sz="0" w:val="none"/>
+          <w:between w:color="auto" w:space="0" w:sz="0" w:val="none"/>
+        </w:pBdr>
+        <w:shd w:fill="ffffff" w:val="clear"/>
+        <w:spacing w:line="480" w:lineRule="auto"/>
+        <w:ind w:left="0" w:firstLine="0"/>
+        <w:jc w:val="both"/>
+        <w:rPr>
+          <w:sz w:val="24"/>
+          <w:szCs w:val="24"/>
+        </w:rPr>
+      </w:pPr>
+      <w:r>
+        <w:rPr>
+          <w:rtl w:val="0"/>
+        </w:rPr>
+      </w:r>
+    </w:p>
+    <w:p>
+      <w:pPr>
+        <w:pBdr>
+          <w:top w:color="auto" w:space="0" w:sz="0" w:val="none"/>
+          <w:left w:color="auto" w:space="0" w:sz="0" w:val="none"/>
+          <w:bottom w:color="auto" w:space="0" w:sz="0" w:val="none"/>
+          <w:right w:color="auto" w:space="0" w:sz="0" w:val="none"/>
+          <w:between w:color="auto" w:space="0" w:sz="0" w:val="none"/>
+        </w:pBdr>
+        <w:shd w:fill="ffffff" w:val="clear"/>
+        <w:spacing w:line="480" w:lineRule="auto"/>
+        <w:ind w:left="0" w:firstLine="0"/>
+        <w:jc w:val="both"/>
+        <w:rPr>
+          <w:sz w:val="24"/>
+          <w:szCs w:val="24"/>
+        </w:rPr>
+      </w:pPr>
+      <w:r>
+        <w:rPr>
+          <w:rtl w:val="0"/>
+        </w:rPr>
+      </w:r>
+    </w:p>
+    <w:p>
+      <w:pPr>
+        <w:pBdr>
+          <w:top w:color="auto" w:space="0" w:sz="0" w:val="none"/>
+          <w:left w:color="auto" w:space="0" w:sz="0" w:val="none"/>
+          <w:bottom w:color="auto" w:space="0" w:sz="0" w:val="none"/>
+          <w:right w:color="auto" w:space="0" w:sz="0" w:val="none"/>
+          <w:between w:color="auto" w:space="0" w:sz="0" w:val="none"/>
+        </w:pBdr>
+        <w:shd w:fill="ffffff" w:val="clear"/>
+        <w:spacing w:line="480" w:lineRule="auto"/>
+        <w:ind w:left="0" w:firstLine="0"/>
+        <w:jc w:val="both"/>
+        <w:rPr>
+          <w:sz w:val="24"/>
+          <w:szCs w:val="24"/>
+        </w:rPr>
+      </w:pPr>
+      <w:r>
+        <w:rPr>
+          <w:rtl w:val="0"/>
+        </w:rPr>
+      </w:r>
+    </w:p>
+    <w:p>
+      <w:pPr>
+        <w:pBdr>
+          <w:top w:color="auto" w:space="0" w:sz="0" w:val="none"/>
+          <w:left w:color="auto" w:space="0" w:sz="0" w:val="none"/>
+          <w:bottom w:color="auto" w:space="0" w:sz="0" w:val="none"/>
+          <w:right w:color="auto" w:space="0" w:sz="0" w:val="none"/>
+          <w:between w:color="auto" w:space="0" w:sz="0" w:val="none"/>
+        </w:pBdr>
+        <w:shd w:fill="ffffff" w:val="clear"/>
+        <w:spacing w:line="480" w:lineRule="auto"/>
+        <w:ind w:left="0" w:firstLine="0"/>
+        <w:jc w:val="both"/>
+        <w:rPr>
+          <w:sz w:val="24"/>
+          <w:szCs w:val="24"/>
+        </w:rPr>
+      </w:pPr>
+      <w:r>
+        <w:rPr>
+          <w:rtl w:val="0"/>
+        </w:rPr>
+      </w:r>
+    </w:p>
+    <w:p>
+      <w:pPr>
+        <w:pBdr>
+          <w:top w:color="auto" w:space="0" w:sz="0" w:val="none"/>
+          <w:left w:color="auto" w:space="0" w:sz="0" w:val="none"/>
+          <w:bottom w:color="auto" w:space="0" w:sz="0" w:val="none"/>
+          <w:right w:color="auto" w:space="0" w:sz="0" w:val="none"/>
+          <w:between w:color="auto" w:space="0" w:sz="0" w:val="none"/>
+        </w:pBdr>
+        <w:shd w:fill="ffffff" w:val="clear"/>
+        <w:spacing w:line="480" w:lineRule="auto"/>
+        <w:ind w:left="0" w:firstLine="0"/>
+        <w:jc w:val="both"/>
+        <w:rPr>
+          <w:sz w:val="24"/>
+          <w:szCs w:val="24"/>
+        </w:rPr>
+      </w:pPr>
+      <w:r>
+        <w:rPr>
+          <w:rtl w:val="0"/>
+        </w:rPr>
+      </w:r>
+    </w:p>
+    <w:p>
+      <w:pPr>
+        <w:pBdr>
+          <w:top w:color="auto" w:space="0" w:sz="0" w:val="none"/>
+          <w:left w:color="auto" w:space="0" w:sz="0" w:val="none"/>
+          <w:bottom w:color="auto" w:space="0" w:sz="0" w:val="none"/>
+          <w:right w:color="auto" w:space="0" w:sz="0" w:val="none"/>
+          <w:between w:color="auto" w:space="0" w:sz="0" w:val="none"/>
+        </w:pBdr>
+        <w:shd w:fill="ffffff" w:val="clear"/>
+        <w:spacing w:line="480" w:lineRule="auto"/>
+        <w:ind w:left="0" w:firstLine="0"/>
+        <w:jc w:val="both"/>
+        <w:rPr>
+          <w:sz w:val="24"/>
+          <w:szCs w:val="24"/>
+        </w:rPr>
+      </w:pPr>
+      <w:r>
+        <w:rPr>
+          <w:rtl w:val="0"/>
+        </w:rPr>
+      </w:r>
+    </w:p>
+    <w:p>
+      <w:pPr>
+        <w:pBdr>
+          <w:top w:color="auto" w:space="0" w:sz="0" w:val="none"/>
+          <w:left w:color="auto" w:space="0" w:sz="0" w:val="none"/>
+          <w:bottom w:color="auto" w:space="0" w:sz="0" w:val="none"/>
+          <w:right w:color="auto" w:space="0" w:sz="0" w:val="none"/>
+          <w:between w:color="auto" w:space="0" w:sz="0" w:val="none"/>
+        </w:pBdr>
+        <w:shd w:fill="ffffff" w:val="clear"/>
+        <w:spacing w:line="480" w:lineRule="auto"/>
+        <w:ind w:left="0" w:firstLine="0"/>
+        <w:jc w:val="both"/>
+        <w:rPr>
+          <w:sz w:val="24"/>
+          <w:szCs w:val="24"/>
+        </w:rPr>
+      </w:pPr>
+      <w:r>
+        <w:rPr>
+          <w:rtl w:val="0"/>
+        </w:rPr>
+      </w:r>
+    </w:p>
+    <w:p>
+      <w:pPr>
+        <w:pBdr>
+          <w:top w:color="auto" w:space="0" w:sz="0" w:val="none"/>
+          <w:left w:color="auto" w:space="0" w:sz="0" w:val="none"/>
+          <w:bottom w:color="auto" w:space="0" w:sz="0" w:val="none"/>
+          <w:right w:color="auto" w:space="0" w:sz="0" w:val="none"/>
+          <w:between w:color="auto" w:space="0" w:sz="0" w:val="none"/>
+        </w:pBdr>
+        <w:shd w:fill="ffffff" w:val="clear"/>
+        <w:spacing w:line="480" w:lineRule="auto"/>
+        <w:ind w:left="0" w:firstLine="0"/>
+        <w:jc w:val="both"/>
+        <w:rPr>
+          <w:sz w:val="24"/>
+          <w:szCs w:val="24"/>
+        </w:rPr>
+      </w:pPr>
+      <w:r>
+        <w:rPr>
+          <w:rtl w:val="0"/>
+        </w:rPr>
+      </w:r>
+    </w:p>
+    <w:p>
+      <w:pPr>
+        <w:pBdr>
+          <w:top w:color="auto" w:space="0" w:sz="0" w:val="none"/>
+          <w:left w:color="auto" w:space="0" w:sz="0" w:val="none"/>
+          <w:bottom w:color="auto" w:space="0" w:sz="0" w:val="none"/>
+          <w:right w:color="auto" w:space="0" w:sz="0" w:val="none"/>
+          <w:between w:color="auto" w:space="0" w:sz="0" w:val="none"/>
+        </w:pBdr>
+        <w:shd w:fill="ffffff" w:val="clear"/>
+        <w:spacing w:line="480" w:lineRule="auto"/>
+        <w:ind w:left="0" w:firstLine="0"/>
+        <w:jc w:val="center"/>
+        <w:rPr>
+          <w:b w:val="1"/>
+          <w:bCs w:val="1"/>
+          <w:sz w:val="24"/>
+          <w:szCs w:val="24"/>
+        </w:rPr>
+      </w:pPr>
+      <w:r>
+        <w:rPr>
+          <w:b w:val="1"/>
+          <w:bCs w:val="1"/>
+          <w:sz w:val="24"/>
+          <w:szCs w:val="24"/>
+          <w:rtl w:val="0"/>
+        </w:rPr>
+        <w:t xml:space="preserve">Chapter 5</w:t>
+      </w:r>
+    </w:p>
+    <w:p>
+      <w:pPr>
+        <w:pBdr>
+          <w:top w:color="auto" w:space="0" w:sz="0" w:val="none"/>
+          <w:left w:color="auto" w:space="0" w:sz="0" w:val="none"/>
+          <w:bottom w:color="auto" w:space="0" w:sz="0" w:val="none"/>
+          <w:right w:color="auto" w:space="0" w:sz="0" w:val="none"/>
+          <w:between w:color="auto" w:space="0" w:sz="0" w:val="none"/>
+        </w:pBdr>
+        <w:shd w:fill="ffffff" w:val="clear"/>
+        <w:spacing w:line="480" w:lineRule="auto"/>
+        <w:ind w:left="0" w:firstLine="0"/>
+        <w:jc w:val="center"/>
+        <w:rPr>
+          <w:b w:val="1"/>
+          <w:bCs w:val="1"/>
           <w:sz w:val="24"/>
           <w:szCs w:val="24"/>
         </w:rPr>

</xml_diff>